<commit_message>
feat(docuseal): agregar placeholders de campos en templates inversiones_sociedad
Co-Authored-By: Claude Opus 4.8 (1M context) <noreply@anthropic.com>
</commit_message>
<xml_diff>
--- a/apps/legal-docs-blueprints/templates/inversiones_Sociedad/acuerdo_inversion/acuerdo_inversion_hombre.docx
+++ b/apps/legal-docs-blueprints/templates/inversiones_Sociedad/acuerdo_inversion/acuerdo_inversion_hombre.docx
@@ -1,6 +1,6 @@
 
 <file path=word/document.xml><?xml version="1.0" encoding="utf-8"?>
-<w:document xmlns:o="urn:schemas-microsoft-com:office:office" xmlns:r="http://schemas.openxmlformats.org/officeDocument/2006/relationships" xmlns:v="urn:schemas-microsoft-com:vml" xmlns:w="http://schemas.openxmlformats.org/wordprocessingml/2006/main" xmlns:w10="urn:schemas-microsoft-com:office:word" xmlns:wp="http://schemas.openxmlformats.org/drawingml/2006/wordprocessingDrawing" xmlns:wps="http://schemas.microsoft.com/office/word/2010/wordprocessingShape" xmlns:wpg="http://schemas.microsoft.com/office/word/2010/wordprocessingGroup" xmlns:mc="http://schemas.openxmlformats.org/markup-compatibility/2006" xmlns:wp14="http://schemas.microsoft.com/office/word/2010/wordprocessingDrawing" xmlns:w14="http://schemas.microsoft.com/office/word/2010/wordml" xmlns:w15="http://schemas.microsoft.com/office/word/2012/wordml" mc:Ignorable="w14 wp14 w15">
+<w:document xmlns:o="urn:schemas-microsoft-com:office:office" xmlns:r="http://schemas.openxmlformats.org/officeDocument/2006/relationships" xmlns:v="urn:schemas-microsoft-com:vml" xmlns:w="http://schemas.openxmlformats.org/wordprocessingml/2006/main" xmlns:w10="urn:schemas-microsoft-com:office:word" xmlns:wp="http://schemas.openxmlformats.org/drawingml/2006/wordprocessingDrawing" xmlns:pic="http://schemas.openxmlformats.org/drawingml/2006/picture" xmlns:wps="http://schemas.microsoft.com/office/word/2010/wordprocessingShape" xmlns:wpg="http://schemas.microsoft.com/office/word/2010/wordprocessingGroup" xmlns:mc="http://schemas.openxmlformats.org/markup-compatibility/2006" xmlns:wp14="http://schemas.microsoft.com/office/word/2010/wordprocessingDrawing" xmlns:w14="http://schemas.microsoft.com/office/word/2010/wordml" xmlns:w15="http://schemas.microsoft.com/office/word/2012/wordml" mc:Ignorable="w14 wp14 w15">
   <w:body>
     <w:p>
       <w:pPr>
@@ -221,16 +221,16 @@
           <w:sz w:val="20"/>
           <w:szCs w:val="20"/>
         </w:rPr>
-        <w:t xml:space="preserve"> extendido por el Registro Nacional de las Personas –RENAP- República de Guatemala Centroamérica, guatemalteco, comerciante, de este domicilio, </w:t>
-      </w:r>
-      <w:r>
-        <w:rPr>
-          <w:rFonts w:eastAsia="Quattrocento Sans" w:cs="Quattrocento Sans"/>
-          <w:color w:val="000000"/>
-          <w:sz w:val="20"/>
-          <w:szCs w:val="20"/>
-        </w:rPr>
-        <w:t>(en adelante también referido como el “INVERSIONISTA);</w:t>
+        <w:t xml:space="preserve"> extendido por el Registro Nacional de las Personas –RENAP- República de Guatemala Centroamérica, guatemalteco, </w:t>
+      </w:r>
+      <w:r>
+        <w:rPr>
+          <w:rFonts w:eastAsia="Quattrocento Sans" w:cs="Quattrocento Sans"/>
+          <w:color w:val="000000"/>
+          <w:sz w:val="20"/>
+          <w:szCs w:val="20"/>
+        </w:rPr>
+        <w:t>comerciante, de este domicilio, Actúo en mi calidad de {responsabilidadInversionista} de la entidad denominada {nombreSociedadInversionista}, lo que acredito con el Acta Notarial en la que consta mi nombramiento, autorizada en la ciudad de Guatemala el día {fechaAutorizacionActaNombramiento} por el Notario {nombreNotarioActaNombramiento} acta que se encuentra inscrita en el Registro Mercantil General de la República al número de Registro: {numeroRegistroSociedad} Folio: {folioRegistroSociedad}; Libro: {libroRegistroSociedad} de Auxiliares de Comercio (en adelante también referido como la “INVERSIONISTA)</w:t>
       </w:r>
     </w:p>
     <w:p>
@@ -1803,7 +1803,6 @@
           <w:b w:val="false"/>
           <w:bCs w:val="false"/>
           <w:i w:val="false"/>
-          <w:i w:val="false"/>
           <w:iCs w:val="false"/>
           <w:caps w:val="false"/>
           <w:smallCaps w:val="false"/>
@@ -1811,7 +1810,6 @@
           <w:dstrike w:val="false"/>
           <w:color w:val="000000"/>
           <w:position w:val="0"/>
-          <w:sz w:val="20"/>
           <w:sz w:val="20"/>
           <w:szCs w:val="20"/>
           <w:u w:val="none"/>
@@ -1833,7 +1831,6 @@
           <w:color w:val="000000"/>
           <w:position w:val="0"/>
           <w:sz w:val="20"/>
-          <w:sz w:val="20"/>
           <w:szCs w:val="20"/>
           <w:u w:val="none"/>
           <w:shd w:fill="auto" w:val="clear"/>
@@ -1855,28 +1852,6 @@
         <w:jc w:val="both"/>
         <w:rPr>
           <w:rFonts w:ascii="Quattrocento Sans" w:hAnsi="Quattrocento Sans" w:eastAsia="Quattrocento Sans" w:cs="Quattrocento Sans"/>
-          <w:b w:val="false"/>
-          <w:bCs w:val="false"/>
-          <w:i w:val="false"/>
-          <w:i w:val="false"/>
-          <w:iCs w:val="false"/>
-          <w:caps w:val="false"/>
-          <w:smallCaps w:val="false"/>
-          <w:strike w:val="false"/>
-          <w:dstrike w:val="false"/>
-          <w:color w:val="000000"/>
-          <w:position w:val="0"/>
-          <w:sz w:val="20"/>
-          <w:sz w:val="20"/>
-          <w:szCs w:val="20"/>
-          <w:u w:val="none"/>
-          <w:shd w:fill="auto" w:val="clear"/>
-          <w:vertAlign w:val="baseline"/>
-        </w:rPr>
-      </w:pPr>
-      <w:r>
-        <w:rPr>
-          <w:rFonts w:eastAsia="Quattrocento Sans" w:cs="Quattrocento Sans"/>
           <w:b w:val="false"/>
           <w:bCs w:val="false"/>
           <w:i w:val="false"/>
@@ -1888,6 +1863,25 @@
           <w:color w:val="000000"/>
           <w:position w:val="0"/>
           <w:sz w:val="20"/>
+          <w:szCs w:val="20"/>
+          <w:u w:val="none"/>
+          <w:shd w:fill="auto" w:val="clear"/>
+          <w:vertAlign w:val="baseline"/>
+        </w:rPr>
+      </w:pPr>
+      <w:r>
+        <w:rPr>
+          <w:rFonts w:eastAsia="Quattrocento Sans" w:cs="Quattrocento Sans"/>
+          <w:b w:val="false"/>
+          <w:bCs w:val="false"/>
+          <w:i w:val="false"/>
+          <w:iCs w:val="false"/>
+          <w:caps w:val="false"/>
+          <w:smallCaps w:val="false"/>
+          <w:strike w:val="false"/>
+          <w:dstrike w:val="false"/>
+          <w:color w:val="000000"/>
+          <w:position w:val="0"/>
           <w:sz w:val="20"/>
           <w:szCs w:val="20"/>
           <w:u w:val="none"/>
@@ -1917,7 +1911,6 @@
           <w:b w:val="false"/>
           <w:bCs w:val="false"/>
           <w:i w:val="false"/>
-          <w:i w:val="false"/>
           <w:iCs w:val="false"/>
           <w:caps w:val="false"/>
           <w:smallCaps w:val="false"/>
@@ -1925,7 +1918,6 @@
           <w:dstrike w:val="false"/>
           <w:color w:val="000000"/>
           <w:position w:val="0"/>
-          <w:sz w:val="20"/>
           <w:sz w:val="20"/>
           <w:szCs w:val="20"/>
           <w:u w:val="none"/>
@@ -1946,7 +1938,6 @@
           <w:dstrike w:val="false"/>
           <w:color w:val="000000"/>
           <w:position w:val="0"/>
-          <w:sz w:val="20"/>
           <w:sz w:val="20"/>
           <w:szCs w:val="20"/>
           <w:u w:val="none"/>
@@ -1976,7 +1967,6 @@
           <w:b w:val="false"/>
           <w:bCs w:val="false"/>
           <w:i w:val="false"/>
-          <w:i w:val="false"/>
           <w:iCs w:val="false"/>
           <w:caps w:val="false"/>
           <w:smallCaps w:val="false"/>
@@ -1984,7 +1974,6 @@
           <w:dstrike w:val="false"/>
           <w:color w:val="000000"/>
           <w:position w:val="0"/>
-          <w:sz w:val="20"/>
           <w:sz w:val="20"/>
           <w:szCs w:val="20"/>
           <w:u w:val="none"/>
@@ -2006,7 +1995,6 @@
           <w:color w:val="000000"/>
           <w:position w:val="0"/>
           <w:sz w:val="20"/>
-          <w:sz w:val="20"/>
           <w:szCs w:val="20"/>
           <w:u w:val="none"/>
           <w:shd w:fill="auto" w:val="clear"/>
@@ -3001,7 +2989,6 @@
           <w:rFonts w:ascii="Quattrocento Sans" w:hAnsi="Quattrocento Sans" w:eastAsia="Quattrocento Sans" w:cs="Quattrocento Sans"/>
           <w:b/>
           <w:bCs/>
-          <w:i/>
           <w:i/>
           <w:iCs/>
           <w:sz w:val="16"/>
@@ -3058,7 +3045,6 @@
           <w:rFonts w:ascii="Quattrocento Sans" w:hAnsi="Quattrocento Sans" w:eastAsia="Quattrocento Sans" w:cs="Quattrocento Sans"/>
           <w:b/>
           <w:bCs/>
-          <w:i/>
           <w:i/>
           <w:iCs/>
           <w:color w:val="000000"/>
@@ -3096,7 +3082,7 @@
 </file>
 
 <file path=word/header1.xml><?xml version="1.0" encoding="utf-8"?>
-<w:hdr xmlns:o="urn:schemas-microsoft-com:office:office" xmlns:r="http://schemas.openxmlformats.org/officeDocument/2006/relationships" xmlns:v="urn:schemas-microsoft-com:vml" xmlns:w="http://schemas.openxmlformats.org/wordprocessingml/2006/main" xmlns:w10="urn:schemas-microsoft-com:office:word" xmlns:wp="http://schemas.openxmlformats.org/drawingml/2006/wordprocessingDrawing" xmlns:wps="http://schemas.microsoft.com/office/word/2010/wordprocessingShape" xmlns:wpg="http://schemas.microsoft.com/office/word/2010/wordprocessingGroup" xmlns:mc="http://schemas.openxmlformats.org/markup-compatibility/2006" xmlns:wp14="http://schemas.microsoft.com/office/word/2010/wordprocessingDrawing" xmlns:w14="http://schemas.microsoft.com/office/word/2010/wordml" xmlns:w15="http://schemas.microsoft.com/office/word/2012/wordml" mc:Ignorable="w14 wp14 w15">
+<w:hdr xmlns:o="urn:schemas-microsoft-com:office:office" xmlns:r="http://schemas.openxmlformats.org/officeDocument/2006/relationships" xmlns:v="urn:schemas-microsoft-com:vml" xmlns:w="http://schemas.openxmlformats.org/wordprocessingml/2006/main" xmlns:w10="urn:schemas-microsoft-com:office:word" xmlns:wp="http://schemas.openxmlformats.org/drawingml/2006/wordprocessingDrawing" xmlns:pic="http://schemas.openxmlformats.org/drawingml/2006/picture" xmlns:wps="http://schemas.microsoft.com/office/word/2010/wordprocessingShape" xmlns:wpg="http://schemas.microsoft.com/office/word/2010/wordprocessingGroup" xmlns:mc="http://schemas.openxmlformats.org/markup-compatibility/2006" xmlns:wp14="http://schemas.microsoft.com/office/word/2010/wordprocessingDrawing" xmlns:w14="http://schemas.microsoft.com/office/word/2010/wordml" xmlns:w15="http://schemas.microsoft.com/office/word/2012/wordml" mc:Ignorable="w14 wp14 w15">
   <w:p>
     <w:pPr>
       <w:pStyle w:val="Header"/>
@@ -3110,11 +3096,11 @@
 </file>
 
 <file path=word/header2.xml><?xml version="1.0" encoding="utf-8"?>
-<w:hdr xmlns:o="urn:schemas-microsoft-com:office:office" xmlns:r="http://schemas.openxmlformats.org/officeDocument/2006/relationships" xmlns:v="urn:schemas-microsoft-com:vml" xmlns:w="http://schemas.openxmlformats.org/wordprocessingml/2006/main" xmlns:w10="urn:schemas-microsoft-com:office:word" xmlns:wp="http://schemas.openxmlformats.org/drawingml/2006/wordprocessingDrawing" xmlns:wps="http://schemas.microsoft.com/office/word/2010/wordprocessingShape" xmlns:wpg="http://schemas.microsoft.com/office/word/2010/wordprocessingGroup" xmlns:mc="http://schemas.openxmlformats.org/markup-compatibility/2006" xmlns:wp14="http://schemas.microsoft.com/office/word/2010/wordprocessingDrawing" xmlns:w14="http://schemas.microsoft.com/office/word/2010/wordml" xmlns:w15="http://schemas.microsoft.com/office/word/2012/wordml" mc:Ignorable="w14 wp14 w15">
+<w:hdr xmlns:o="urn:schemas-microsoft-com:office:office" xmlns:r="http://schemas.openxmlformats.org/officeDocument/2006/relationships" xmlns:v="urn:schemas-microsoft-com:vml" xmlns:w="http://schemas.openxmlformats.org/wordprocessingml/2006/main" xmlns:w10="urn:schemas-microsoft-com:office:word" xmlns:wp="http://schemas.openxmlformats.org/drawingml/2006/wordprocessingDrawing" xmlns:pic="http://schemas.openxmlformats.org/drawingml/2006/picture" xmlns:wps="http://schemas.microsoft.com/office/word/2010/wordprocessingShape" xmlns:wpg="http://schemas.microsoft.com/office/word/2010/wordprocessingGroup" xmlns:mc="http://schemas.openxmlformats.org/markup-compatibility/2006" xmlns:wp14="http://schemas.microsoft.com/office/word/2010/wordprocessingDrawing" xmlns:w14="http://schemas.microsoft.com/office/word/2010/wordml" xmlns:w15="http://schemas.microsoft.com/office/word/2012/wordml" mc:Ignorable="w14 wp14 w15">
   <w:p>
     <w:pPr>
       <w:pStyle w:val="normal1"/>
-      <w:spacing w:lineRule="auto" w:line="9"/>
+      <w:spacing w:lineRule="auto" w:line="10"/>
       <w:rPr>
         <w:color w:val="000000"/>
         <w:sz w:val="20"/>
@@ -3128,7 +3114,7 @@
         <w:szCs w:val="20"/>
       </w:rPr>
       <w:drawing>
-        <wp:anchor behindDoc="1" distT="0" distB="0" distL="0" distR="0" simplePos="0" locked="0" layoutInCell="0" allowOverlap="1" relativeHeight="11">
+        <wp:anchor distT="0" distB="0" distL="0" distR="0" simplePos="0" relativeHeight="12" behindDoc="1" locked="0" layoutInCell="0" allowOverlap="1">
           <wp:simplePos x="0" y="0"/>
           <wp:positionH relativeFrom="page">
             <wp:posOffset>1236345</wp:posOffset>
@@ -3139,7 +3125,7 @@
           <wp:extent cx="1876425" cy="614045"/>
           <wp:effectExtent l="0" t="0" r="0" b="0"/>
           <wp:wrapNone/>
-          <wp:docPr id="1" name="image1.jpg" descr=""/>
+          <wp:docPr id="1" name="image1.jpg"/>
           <wp:cNvGraphicFramePr>
             <a:graphicFrameLocks xmlns:a="http://schemas.openxmlformats.org/drawingml/2006/main" noChangeAspect="1"/>
           </wp:cNvGraphicFramePr>
@@ -3147,7 +3133,7 @@
             <a:graphicData uri="http://schemas.openxmlformats.org/drawingml/2006/picture">
               <pic:pic xmlns:pic="http://schemas.openxmlformats.org/drawingml/2006/picture">
                 <pic:nvPicPr>
-                  <pic:cNvPr id="1" name="image1.jpg" descr=""/>
+                  <pic:cNvPr id="1" name="image1.jpg"/>
                   <pic:cNvPicPr>
                     <a:picLocks noChangeAspect="1" noChangeArrowheads="1"/>
                   </pic:cNvPicPr>
@@ -3166,6 +3152,7 @@
                   <a:prstGeom prst="rect">
                     <a:avLst/>
                   </a:prstGeom>
+                  <a:noFill/>
                 </pic:spPr>
               </pic:pic>
             </a:graphicData>
@@ -3178,11 +3165,11 @@
 </file>
 
 <file path=word/header3.xml><?xml version="1.0" encoding="utf-8"?>
-<w:hdr xmlns:o="urn:schemas-microsoft-com:office:office" xmlns:r="http://schemas.openxmlformats.org/officeDocument/2006/relationships" xmlns:v="urn:schemas-microsoft-com:vml" xmlns:w="http://schemas.openxmlformats.org/wordprocessingml/2006/main" xmlns:w10="urn:schemas-microsoft-com:office:word" xmlns:wp="http://schemas.openxmlformats.org/drawingml/2006/wordprocessingDrawing" xmlns:wps="http://schemas.microsoft.com/office/word/2010/wordprocessingShape" xmlns:wpg="http://schemas.microsoft.com/office/word/2010/wordprocessingGroup" xmlns:mc="http://schemas.openxmlformats.org/markup-compatibility/2006" xmlns:wp14="http://schemas.microsoft.com/office/word/2010/wordprocessingDrawing" xmlns:w14="http://schemas.microsoft.com/office/word/2010/wordml" xmlns:w15="http://schemas.microsoft.com/office/word/2012/wordml" mc:Ignorable="w14 wp14 w15">
+<w:hdr xmlns:o="urn:schemas-microsoft-com:office:office" xmlns:r="http://schemas.openxmlformats.org/officeDocument/2006/relationships" xmlns:v="urn:schemas-microsoft-com:vml" xmlns:w="http://schemas.openxmlformats.org/wordprocessingml/2006/main" xmlns:w10="urn:schemas-microsoft-com:office:word" xmlns:wp="http://schemas.openxmlformats.org/drawingml/2006/wordprocessingDrawing" xmlns:pic="http://schemas.openxmlformats.org/drawingml/2006/picture" xmlns:wps="http://schemas.microsoft.com/office/word/2010/wordprocessingShape" xmlns:wpg="http://schemas.microsoft.com/office/word/2010/wordprocessingGroup" xmlns:mc="http://schemas.openxmlformats.org/markup-compatibility/2006" xmlns:wp14="http://schemas.microsoft.com/office/word/2010/wordprocessingDrawing" xmlns:w14="http://schemas.microsoft.com/office/word/2010/wordml" xmlns:w15="http://schemas.microsoft.com/office/word/2012/wordml" mc:Ignorable="w14 wp14 w15">
   <w:p>
     <w:pPr>
       <w:pStyle w:val="normal1"/>
-      <w:spacing w:lineRule="auto" w:line="9"/>
+      <w:spacing w:lineRule="auto" w:line="10"/>
       <w:rPr>
         <w:color w:val="000000"/>
         <w:sz w:val="20"/>
@@ -3196,7 +3183,7 @@
         <w:szCs w:val="20"/>
       </w:rPr>
       <w:drawing>
-        <wp:anchor behindDoc="1" distT="0" distB="0" distL="0" distR="0" simplePos="0" locked="0" layoutInCell="0" allowOverlap="1" relativeHeight="11">
+        <wp:anchor distT="0" distB="0" distL="0" distR="0" simplePos="0" relativeHeight="12" behindDoc="1" locked="0" layoutInCell="0" allowOverlap="1">
           <wp:simplePos x="0" y="0"/>
           <wp:positionH relativeFrom="page">
             <wp:posOffset>1236345</wp:posOffset>
@@ -3207,7 +3194,7 @@
           <wp:extent cx="1876425" cy="614045"/>
           <wp:effectExtent l="0" t="0" r="0" b="0"/>
           <wp:wrapNone/>
-          <wp:docPr id="2" name="image1.jpg" descr=""/>
+          <wp:docPr id="2" name="image1.jpg"/>
           <wp:cNvGraphicFramePr>
             <a:graphicFrameLocks xmlns:a="http://schemas.openxmlformats.org/drawingml/2006/main" noChangeAspect="1"/>
           </wp:cNvGraphicFramePr>
@@ -3215,7 +3202,7 @@
             <a:graphicData uri="http://schemas.openxmlformats.org/drawingml/2006/picture">
               <pic:pic xmlns:pic="http://schemas.openxmlformats.org/drawingml/2006/picture">
                 <pic:nvPicPr>
-                  <pic:cNvPr id="2" name="image1.jpg" descr=""/>
+                  <pic:cNvPr id="2" name="image1.jpg"/>
                   <pic:cNvPicPr>
                     <a:picLocks noChangeAspect="1" noChangeArrowheads="1"/>
                   </pic:cNvPicPr>
@@ -3234,6 +3221,7 @@
                   <a:prstGeom prst="rect">
                     <a:avLst/>
                   </a:prstGeom>
+                  <a:noFill/>
                 </pic:spPr>
               </pic:pic>
             </a:graphicData>
@@ -3260,13 +3248,13 @@
         <w:ind w:left="720" w:hanging="360"/>
       </w:pPr>
       <w:rPr>
+        <w:rFonts w:ascii="Quattrocento Sans" w:hAnsi="Quattrocento Sans" w:eastAsia="Quattrocento Sans" w:cs="Quattrocento Sans"/>
+        <w:b w:val="false"/>
+        <w:bCs w:val="false"/>
+        <w:i w:val="false"/>
+        <w:iCs w:val="false"/>
         <w:sz w:val="20"/>
-        <w:i w:val="false"/>
-        <w:b w:val="false"/>
         <w:szCs w:val="20"/>
-        <w:iCs w:val="false"/>
-        <w:bCs w:val="false"/>
-        <w:rFonts w:ascii="Quattrocento Sans" w:hAnsi="Quattrocento Sans" w:eastAsia="Quattrocento Sans" w:cs="Quattrocento Sans"/>
       </w:rPr>
     </w:lvl>
     <w:lvl w:ilvl="1">
@@ -3403,13 +3391,13 @@
         <w:ind w:left="1080" w:hanging="720"/>
       </w:pPr>
       <w:rPr>
+        <w:rFonts w:ascii="Quattrocento Sans" w:hAnsi="Quattrocento Sans" w:eastAsia="Quattrocento Sans" w:cs="Quattrocento Sans"/>
+        <w:b w:val="false"/>
+        <w:bCs w:val="false"/>
+        <w:i w:val="false"/>
+        <w:iCs w:val="false"/>
         <w:sz w:val="20"/>
-        <w:i w:val="false"/>
-        <w:b w:val="false"/>
         <w:szCs w:val="20"/>
-        <w:iCs w:val="false"/>
-        <w:bCs w:val="false"/>
-        <w:rFonts w:ascii="Quattrocento Sans" w:hAnsi="Quattrocento Sans" w:eastAsia="Quattrocento Sans" w:cs="Quattrocento Sans"/>
       </w:rPr>
     </w:lvl>
     <w:lvl w:ilvl="1">
@@ -3546,13 +3534,13 @@
         <w:ind w:left="0" w:hanging="247"/>
       </w:pPr>
       <w:rPr>
+        <w:rFonts w:ascii="Quattrocento Sans" w:hAnsi="Quattrocento Sans" w:eastAsia="Quattrocento Sans" w:cs="Quattrocento Sans"/>
+        <w:b/>
+        <w:bCs/>
+        <w:i w:val="false"/>
+        <w:iCs w:val="false"/>
         <w:sz w:val="20"/>
-        <w:i w:val="false"/>
-        <w:b/>
         <w:szCs w:val="20"/>
-        <w:iCs w:val="false"/>
-        <w:bCs/>
-        <w:rFonts w:ascii="Quattrocento Sans" w:hAnsi="Quattrocento Sans" w:eastAsia="Quattrocento Sans" w:cs="Quattrocento Sans"/>
       </w:rPr>
     </w:lvl>
     <w:lvl w:ilvl="1">
@@ -3567,13 +3555,13 @@
         <w:ind w:left="394" w:hanging="394"/>
       </w:pPr>
       <w:rPr>
+        <w:rFonts w:ascii="Quattrocento Sans" w:hAnsi="Quattrocento Sans" w:eastAsia="Quattrocento Sans" w:cs="Quattrocento Sans"/>
+        <w:b/>
+        <w:bCs/>
+        <w:i w:val="false"/>
+        <w:iCs w:val="false"/>
         <w:sz w:val="20"/>
-        <w:i w:val="false"/>
-        <w:b/>
         <w:szCs w:val="20"/>
-        <w:iCs w:val="false"/>
-        <w:bCs/>
-        <w:rFonts w:ascii="Quattrocento Sans" w:hAnsi="Quattrocento Sans" w:eastAsia="Quattrocento Sans" w:cs="Quattrocento Sans"/>
       </w:rPr>
     </w:lvl>
     <w:lvl w:ilvl="2">
@@ -3589,12 +3577,12 @@
       </w:pPr>
       <w:rPr>
         <w:rFonts w:ascii="Noto Sans Symbols" w:hAnsi="Noto Sans Symbols" w:cs="Noto Sans Symbols" w:hint="default"/>
+        <w:b w:val="false"/>
+        <w:bCs w:val="false"/>
+        <w:i w:val="false"/>
+        <w:iCs w:val="false"/>
         <w:sz w:val="20"/>
-        <w:i w:val="false"/>
-        <w:b w:val="false"/>
         <w:szCs w:val="20"/>
-        <w:iCs w:val="false"/>
-        <w:bCs w:val="false"/>
       </w:rPr>
     </w:lvl>
     <w:lvl w:ilvl="3">
@@ -3981,7 +3969,7 @@
     </w:rPr>
   </w:style>
   <w:style w:type="paragraph" w:styleId="Heading1">
-    <w:name w:val="Heading 1"/>
+    <w:name w:val="heading 1"/>
     <w:basedOn w:val="normal1"/>
     <w:next w:val="normal1"/>
     <w:qFormat/>
@@ -3998,7 +3986,7 @@
     </w:rPr>
   </w:style>
   <w:style w:type="paragraph" w:styleId="Heading2">
-    <w:name w:val="Heading 2"/>
+    <w:name w:val="heading 2"/>
     <w:basedOn w:val="normal1"/>
     <w:next w:val="normal1"/>
     <w:qFormat/>
@@ -4015,7 +4003,7 @@
     </w:rPr>
   </w:style>
   <w:style w:type="paragraph" w:styleId="Heading3">
-    <w:name w:val="Heading 3"/>
+    <w:name w:val="heading 3"/>
     <w:basedOn w:val="normal1"/>
     <w:next w:val="normal1"/>
     <w:qFormat/>
@@ -4032,7 +4020,7 @@
     </w:rPr>
   </w:style>
   <w:style w:type="paragraph" w:styleId="Heading4">
-    <w:name w:val="Heading 4"/>
+    <w:name w:val="heading 4"/>
     <w:basedOn w:val="normal1"/>
     <w:next w:val="normal1"/>
     <w:qFormat/>
@@ -4049,7 +4037,7 @@
     </w:rPr>
   </w:style>
   <w:style w:type="paragraph" w:styleId="Heading5">
-    <w:name w:val="Heading 5"/>
+    <w:name w:val="heading 5"/>
     <w:basedOn w:val="normal1"/>
     <w:next w:val="normal1"/>
     <w:qFormat/>
@@ -4064,7 +4052,7 @@
     </w:rPr>
   </w:style>
   <w:style w:type="paragraph" w:styleId="Heading6">
-    <w:name w:val="Heading 6"/>
+    <w:name w:val="heading 6"/>
     <w:basedOn w:val="normal1"/>
     <w:next w:val="normal1"/>
     <w:qFormat/>
@@ -4112,7 +4100,7 @@
     </w:rPr>
   </w:style>
   <w:style w:type="paragraph" w:styleId="Caption">
-    <w:name w:val="Caption"/>
+    <w:name w:val="caption"/>
     <w:basedOn w:val="Normal"/>
     <w:qFormat/>
     <w:pPr>
@@ -4129,6 +4117,32 @@
   </w:style>
   <w:style w:type="paragraph" w:styleId="ndice">
     <w:name w:val="Índice"/>
+    <w:basedOn w:val="Normal"/>
+    <w:qFormat/>
+    <w:pPr>
+      <w:suppressLineNumbers/>
+    </w:pPr>
+    <w:rPr>
+      <w:rFonts w:cs="Noto Sans Devanagari"/>
+    </w:rPr>
+  </w:style>
+  <w:style w:type="paragraph" w:styleId="Ttulouser">
+    <w:name w:val="Título (user)"/>
+    <w:basedOn w:val="Normal"/>
+    <w:next w:val="BodyText"/>
+    <w:qFormat/>
+    <w:pPr>
+      <w:keepNext w:val="true"/>
+      <w:spacing w:before="240" w:after="120"/>
+    </w:pPr>
+    <w:rPr>
+      <w:rFonts w:ascii="Liberation Sans" w:hAnsi="Liberation Sans" w:eastAsia="Noto Sans CJK SC" w:cs="Noto Sans Devanagari"/>
+      <w:sz w:val="28"/>
+      <w:szCs w:val="28"/>
+    </w:rPr>
+  </w:style>
+  <w:style w:type="paragraph" w:styleId="ndiceuser">
+    <w:name w:val="Índice (user)"/>
     <w:basedOn w:val="Normal"/>
     <w:qFormat/>
     <w:pPr>
@@ -4193,6 +4207,13 @@
       <w:szCs w:val="48"/>
     </w:rPr>
   </w:style>
+  <w:style w:type="paragraph" w:styleId="Cabeceraypieuser">
+    <w:name w:val="Cabecera y pie (user)"/>
+    <w:basedOn w:val="Normal"/>
+    <w:qFormat/>
+    <w:pPr/>
+    <w:rPr/>
+  </w:style>
   <w:style w:type="paragraph" w:styleId="Cabeceraypie">
     <w:name w:val="Cabecera y pie"/>
     <w:basedOn w:val="Normal"/>
@@ -4201,8 +4222,8 @@
     <w:rPr/>
   </w:style>
   <w:style w:type="paragraph" w:styleId="Header">
-    <w:name w:val="Header"/>
-    <w:basedOn w:val="Cabeceraypie"/>
+    <w:name w:val="header"/>
+    <w:basedOn w:val="Cabeceraypieuser"/>
     <w:pPr/>
     <w:rPr/>
   </w:style>
@@ -4228,34 +4249,34 @@
         <a:srgbClr val="000000"/>
       </a:dk1>
       <a:lt1>
-        <a:srgbClr val="ffffff"/>
+        <a:srgbClr val="FFFFFF"/>
       </a:lt1>
       <a:dk2>
-        <a:srgbClr val="1f497d"/>
+        <a:srgbClr val="1F497D"/>
       </a:dk2>
       <a:lt2>
-        <a:srgbClr val="eeece1"/>
+        <a:srgbClr val="EEECE1"/>
       </a:lt2>
       <a:accent1>
-        <a:srgbClr val="4f81bd"/>
+        <a:srgbClr val="4F81BD"/>
       </a:accent1>
       <a:accent2>
-        <a:srgbClr val="c0504d"/>
+        <a:srgbClr val="C0504D"/>
       </a:accent2>
       <a:accent3>
-        <a:srgbClr val="9bbb59"/>
+        <a:srgbClr val="9BBB59"/>
       </a:accent3>
       <a:accent4>
-        <a:srgbClr val="8064a2"/>
+        <a:srgbClr val="8064A2"/>
       </a:accent4>
       <a:accent5>
-        <a:srgbClr val="4bacc6"/>
+        <a:srgbClr val="4BACC6"/>
       </a:accent5>
       <a:accent6>
-        <a:srgbClr val="f79646"/>
+        <a:srgbClr val="F79646"/>
       </a:accent6>
       <a:hlink>
-        <a:srgbClr val="0000ff"/>
+        <a:srgbClr val="0000FF"/>
       </a:hlink>
       <a:folHlink>
         <a:srgbClr val="800080"/>

</xml_diff>

<commit_message>
feat(inversiones_sociedad): actualizar y ajustar plantillas de documentos .docx
</commit_message>
<xml_diff>
--- a/apps/legal-docs-blueprints/templates/inversiones_Sociedad/acuerdo_inversion/acuerdo_inversion_hombre.docx
+++ b/apps/legal-docs-blueprints/templates/inversiones_Sociedad/acuerdo_inversion/acuerdo_inversion_hombre.docx
@@ -230,7 +230,27 @@
           <w:sz w:val="20"/>
           <w:szCs w:val="20"/>
         </w:rPr>
-        <w:t>comerciante, de este domicilio, Actúo en mi calidad de {responsabilidadInversionista} de la entidad denominada {nombreSociedadInversionista}, lo que acredito con el Acta Notarial en la que consta mi nombramiento, autorizada en la ciudad de Guatemala el día {fechaAutorizacionActaNombramiento} por el Notario {nombreNotarioActaNombramiento} acta que se encuentra inscrita en el Registro Mercantil General de la República al número de Registro: {numeroRegistroSociedad} Folio: {folioRegistroSociedad}; Libro: {libroRegistroSociedad} de Auxiliares de Comercio (en adelante también referido como la “INVERSIONISTA)</w:t>
+        <w:t xml:space="preserve">comerciante, de este domicilio, Actúo en mi calidad de {responsabilidadInversionista} de la entidad denominada </w:t>
+      </w:r>
+      <w:r>
+        <w:rPr>
+          <w:rFonts w:eastAsia="Quattrocento Sans" w:cs="Quattrocento Sans"/>
+          <w:b/>
+          <w:bCs/>
+          <w:color w:val="000000"/>
+          <w:sz w:val="20"/>
+          <w:szCs w:val="20"/>
+        </w:rPr>
+        <w:t>{nombreSociedadInversionista}</w:t>
+      </w:r>
+      <w:r>
+        <w:rPr>
+          <w:rFonts w:eastAsia="Quattrocento Sans" w:cs="Quattrocento Sans"/>
+          <w:color w:val="000000"/>
+          <w:sz w:val="20"/>
+          <w:szCs w:val="20"/>
+        </w:rPr>
+        <w:t>, lo que acredito con el Acta Notarial en la que consta mi nombramiento, autorizada en la ciudad de Guatemala el día {fechaAutorizacionActaNombramiento} por el Notario {nombreNotarioActaNombramiento} acta que se encuentra inscrita en el Registro Mercantil General de la República al número de Registro: {numeroRegistroSociedad} Folio: {folioRegistroSociedad}; Libro: {libroRegistroSociedad} de Auxiliares de Comercio (en adelante también referido como la “INVERSIONISTA)</w:t>
       </w:r>
     </w:p>
     <w:p>
@@ -4207,6 +4227,13 @@
       <w:szCs w:val="48"/>
     </w:rPr>
   </w:style>
+  <w:style w:type="paragraph" w:styleId="Cabeceraypie">
+    <w:name w:val="Cabecera y pie"/>
+    <w:basedOn w:val="Normal"/>
+    <w:qFormat/>
+    <w:pPr/>
+    <w:rPr/>
+  </w:style>
   <w:style w:type="paragraph" w:styleId="Cabeceraypieuser">
     <w:name w:val="Cabecera y pie (user)"/>
     <w:basedOn w:val="Normal"/>
@@ -4214,16 +4241,9 @@
     <w:pPr/>
     <w:rPr/>
   </w:style>
-  <w:style w:type="paragraph" w:styleId="Cabeceraypie">
-    <w:name w:val="Cabecera y pie"/>
-    <w:basedOn w:val="Normal"/>
-    <w:qFormat/>
-    <w:pPr/>
-    <w:rPr/>
-  </w:style>
   <w:style w:type="paragraph" w:styleId="Header">
     <w:name w:val="header"/>
-    <w:basedOn w:val="Cabeceraypieuser"/>
+    <w:basedOn w:val="Cabeceraypie"/>
     <w:pPr/>
     <w:rPr/>
   </w:style>

</xml_diff>